<commit_message>
Verify first-draft publication and finalize the complete handover
Record verified main publication, refresh the team checklist/package and preserve active CSV byte endings.
</commit_message>
<xml_diff>
--- a/task3/team/First_Draft_Team_Plan.docx
+++ b/task3/team/First_Draft_Team_Plan.docx
@@ -5086,7 +5086,7 @@
         <w:tc>
           <w:tcPr>
             <w:tcW w:type="dxa" w:w="1134"/>
-            <w:shd w:fill="FFF2CC"/>
+            <w:shd w:fill="E2F0D9"/>
           </w:tcPr>
           <w:p>
             <w:pPr>
@@ -5096,7 +5096,7 @@
               <w:rPr>
                 <w:sz w:val="20"/>
               </w:rPr>
-              <w:t>Yellow</w:t>
+              <w:t>Green</w:t>
             </w:r>
           </w:p>
         </w:tc>
@@ -5112,7 +5112,7 @@
               <w:rPr>
                 <w:sz w:val="20"/>
               </w:rPr>
-              <w:t>Use publication_receipt.json for verified remote commit; a local commit is not proof of main.</w:t>
+              <w:t>Research content verified on main at13f31ca. See publication_receipt.json; later package updates may follow.</w:t>
             </w:r>
           </w:p>
         </w:tc>

</xml_diff>